<commit_message>
Rename krb-credd to orthrus
Renames the broker daemon from krb-credd to orthrus across code, packaging,
systemd, scripts, docs and diagrams:

- console script, bin/ wrapper and systemd unit are now orthrus
- docs/krb-credd-* and docs/craft-vs-krb-credd-* files renamed to orthrus
- matplotlib diagrams regenerated from their scripts; data-flow-executive
  PNG/PDF re-rendered from the updated SVG
- Office documents updated in place

Kept unchanged so existing deployments keep working: Python module
krbhpc.credd, /etc/krb-hpc/credd.conf, and the /etc, /var/lib and /run
krb-hpc paths. CHANGELOG history and recorded test output keep the old name.

Co-Authored-By: Claude Opus 5.5 <noreply@anthropic.com>
Claude-Session: https://claude.ai/code/session_01YXWe6Bttfs9f2iyVP3TzzG
</commit_message>
<xml_diff>
--- a/docs/Sybil-AD-Incompatibility.docx
+++ b/docs/Sybil-AD-Incompatibility.docx
@@ -4365,7 +4365,7 @@
           <w:sz w:val="21"/>
           <w:szCs w:val="21"/>
         </w:rPr>
-        <w:t xml:space="preserve">krb-credd</w:t>
+        <w:t xml:space="preserve">orthrus</w:t>
       </w:r>
       <w:r>
         <w:rPr>
@@ -4406,7 +4406,7 @@
           <w:sz w:val="21"/>
           <w:szCs w:val="21"/>
         </w:rPr>
-        <w:t xml:space="preserve">docs/krb-credd-architecture.svg</w:t>
+        <w:t xml:space="preserve">docs/orthrus-architecture.svg</w:t>
       </w:r>
       <w:r>
         <w:rPr>

</xml_diff>